<commit_message>
feat: embed mockup wireframe and UI component specifications table in generated SRS docx/pdf
</commit_message>
<xml_diff>
--- a/srs_template-ieee.docx
+++ b/srs_template-ieee.docx
@@ -7454,6 +7454,180 @@
         <w:t xml:space="preserve">  </w:t>
       </w:r>
     </w:p>
+    <w:p>
+      <w:pPr>
+        <w:pStyle w:val="Heading2"/>
+      </w:pPr>
+      <w:r>
+        <w:t>B.3 User Interface Mockup &amp; UI Component Specifications</w:t>
+      </w:r>
+    </w:p>
+    <w:p>
+      <w:pPr>
+        <w:pStyle w:val="BodyText"/>
+      </w:pPr>
+      <w:r>
+        <w:t>Mockup Screen Name: {{ page_name }}</w:t>
+      </w:r>
+    </w:p>
+    <w:p>
+      <w:pPr>
+        <w:jc w:val="center"/>
+      </w:pPr>
+      <w:r>
+        <w:t>{{ mockup_image }}</w:t>
+      </w:r>
+    </w:p>
+    <w:p>
+      <w:pPr>
+        <w:pStyle w:val="Heading2"/>
+      </w:pPr>
+      <w:r>
+        <w:t>B.4 UI Component Specification Table</w:t>
+      </w:r>
+    </w:p>
+    <w:tbl>
+      <w:tblPr>
+        <w:tblStyle w:val="TableGrid"/>
+        <w:tblW w:type="auto" w:w="0"/>
+        <w:tblLook w:firstColumn="1" w:firstRow="1" w:lastColumn="0" w:lastRow="0" w:noHBand="0" w:noVBand="1" w:val="04A0"/>
+      </w:tblPr>
+      <w:tblGrid>
+        <w:gridCol w:w="2610"/>
+        <w:gridCol w:w="2610"/>
+        <w:gridCol w:w="2610"/>
+        <w:gridCol w:w="2610"/>
+      </w:tblGrid>
+      <w:tr>
+        <w:tc>
+          <w:tcPr>
+            <w:tcW w:type="dxa" w:w="2610"/>
+          </w:tcPr>
+          <w:p>
+            <w:r>
+              <w:rPr>
+                <w:b/>
+              </w:rPr>
+              <w:t>ID</w:t>
+            </w:r>
+          </w:p>
+        </w:tc>
+        <w:tc>
+          <w:tcPr>
+            <w:tcW w:type="dxa" w:w="2610"/>
+          </w:tcPr>
+          <w:p>
+            <w:r>
+              <w:rPr>
+                <w:b/>
+              </w:rPr>
+              <w:t>Type</w:t>
+            </w:r>
+          </w:p>
+        </w:tc>
+        <w:tc>
+          <w:tcPr>
+            <w:tcW w:type="dxa" w:w="2610"/>
+          </w:tcPr>
+          <w:p>
+            <w:r>
+              <w:rPr>
+                <w:b/>
+              </w:rPr>
+              <w:t>Label</w:t>
+            </w:r>
+          </w:p>
+        </w:tc>
+        <w:tc>
+          <w:tcPr>
+            <w:tcW w:type="dxa" w:w="2610"/>
+          </w:tcPr>
+          <w:p>
+            <w:r>
+              <w:rPr>
+                <w:b/>
+              </w:rPr>
+              <w:t>Description</w:t>
+            </w:r>
+          </w:p>
+        </w:tc>
+      </w:tr>
+      <w:tr>
+        <w:tc>
+          <w:tcPr>
+            <w:tcW w:type="dxa" w:w="2610"/>
+          </w:tcPr>
+          <w:p>
+            <w:r>
+              <w:t>{% for el in ui_elements %}{{ el.id }}</w:t>
+            </w:r>
+          </w:p>
+        </w:tc>
+        <w:tc>
+          <w:tcPr>
+            <w:tcW w:type="dxa" w:w="2610"/>
+          </w:tcPr>
+          <w:p>
+            <w:r>
+              <w:t>{{ el.type }}</w:t>
+            </w:r>
+          </w:p>
+        </w:tc>
+        <w:tc>
+          <w:tcPr>
+            <w:tcW w:type="dxa" w:w="2610"/>
+          </w:tcPr>
+          <w:p>
+            <w:r>
+              <w:t>{{ el.label }}</w:t>
+            </w:r>
+          </w:p>
+        </w:tc>
+        <w:tc>
+          <w:tcPr>
+            <w:tcW w:type="dxa" w:w="2610"/>
+          </w:tcPr>
+          <w:p>
+            <w:r>
+              <w:t>{{ el.description }}{% endfor %}</w:t>
+            </w:r>
+          </w:p>
+        </w:tc>
+      </w:tr>
+    </w:tbl>
+    <w:p>
+      <w:pPr>
+        <w:pStyle w:val="Heading2"/>
+      </w:pPr>
+      <w:r>
+        <w:t>B.5 Detected User Flows</w:t>
+      </w:r>
+    </w:p>
+    <w:p>
+      <w:pPr>
+        <w:pStyle w:val="BodyText"/>
+      </w:pPr>
+      <w:r>
+        <w:t>{% for flow in detected_user_flows %}</w:t>
+      </w:r>
+    </w:p>
+    <w:p>
+      <w:pPr>
+        <w:pStyle w:val="ListParagraph"/>
+      </w:pPr>
+      <w:r>
+        <w:t>- {{ flow }}</w:t>
+      </w:r>
+    </w:p>
+    <w:p>
+      <w:pPr>
+        <w:pStyle w:val="BodyText"/>
+      </w:pPr>
+      <w:r>
+        <w:t>{% endfor %}</w:t>
+      </w:r>
+    </w:p>
+    <w:p/>
     <w:p>
       <w:pPr>
         <w:pStyle w:val="Heading1"/>

</xml_diff>

<commit_message>
fix: update srs_template-ieee.docx to use %tr for UI elements table row looping
</commit_message>
<xml_diff>
--- a/srs_template-ieee.docx
+++ b/srs_template-ieee.docx
@@ -7559,7 +7559,7 @@
           </w:tcPr>
           <w:p>
             <w:r>
-              <w:t>{% for el in ui_elements %}{{ el.id }}</w:t>
+              <w:t>{%tr for el in ui_elements %}{{ el.id }}</w:t>
             </w:r>
           </w:p>
         </w:tc>
@@ -7589,7 +7589,7 @@
           </w:tcPr>
           <w:p>
             <w:r>
-              <w:t>{{ el.description }}{% endfor %}</w:t>
+              <w:t>{{ el.description }}{%tr endfor %}</w:t>
             </w:r>
           </w:p>
         </w:tc>

</xml_diff>

<commit_message>
fix: rebuild template Table 2 using 4-row layout to resolve XML run-splitting and get_undeclared_template_variables compilation error
</commit_message>
<xml_diff>
--- a/srs_template-ieee.docx
+++ b/srs_template-ieee.docx
@@ -7559,7 +7559,37 @@
           </w:tcPr>
           <w:p>
             <w:r>
-              <w:t>{%tr for el in ui_elements %}{{ el.id }}</w:t>
+              <w:t>{%tr for el in ui_elements %}</w:t>
+            </w:r>
+          </w:p>
+        </w:tc>
+        <w:tc>
+          <w:tcPr>
+            <w:tcW w:type="dxa" w:w="2610"/>
+          </w:tcPr>
+          <w:p/>
+        </w:tc>
+        <w:tc>
+          <w:tcPr>
+            <w:tcW w:type="dxa" w:w="2610"/>
+          </w:tcPr>
+          <w:p/>
+        </w:tc>
+        <w:tc>
+          <w:tcPr>
+            <w:tcW w:type="dxa" w:w="2610"/>
+          </w:tcPr>
+          <w:p/>
+        </w:tc>
+      </w:tr>
+      <w:tr>
+        <w:tc>
+          <w:tcPr>
+            <w:tcW w:type="dxa" w:w="2610"/>
+          </w:tcPr>
+          <w:p>
+            <w:r>
+              <w:t>{{ el.id }}</w:t>
             </w:r>
           </w:p>
         </w:tc>
@@ -7589,9 +7619,39 @@
           </w:tcPr>
           <w:p>
             <w:r>
-              <w:t>{{ el.description }}{%tr endfor %}</w:t>
+              <w:t>{{ el.description }}</w:t>
             </w:r>
           </w:p>
+        </w:tc>
+      </w:tr>
+      <w:tr>
+        <w:tc>
+          <w:tcPr>
+            <w:tcW w:type="dxa" w:w="2610"/>
+          </w:tcPr>
+          <w:p>
+            <w:r>
+              <w:t>{%tr endfor %}</w:t>
+            </w:r>
+          </w:p>
+        </w:tc>
+        <w:tc>
+          <w:tcPr>
+            <w:tcW w:type="dxa" w:w="2610"/>
+          </w:tcPr>
+          <w:p/>
+        </w:tc>
+        <w:tc>
+          <w:tcPr>
+            <w:tcW w:type="dxa" w:w="2610"/>
+          </w:tcPr>
+          <w:p/>
+        </w:tc>
+        <w:tc>
+          <w:tcPr>
+            <w:tcW w:type="dxa" w:w="2610"/>
+          </w:tcPr>
+          <w:p/>
         </w:tc>
       </w:tr>
     </w:tbl>

</xml_diff>